<commit_message>
Added latest NASA files
</commit_message>
<xml_diff>
--- a/2024-05-04to05-10 (A5) C384400 NASA/01_02v01_Base Camp Artemis_SponsorStartUpMeeting.docx
+++ b/2024-05-04to05-10 (A5) C384400 NASA/01_02v01_Base Camp Artemis_SponsorStartUpMeeting.docx
@@ -1,6 +1,6 @@
 
 <file path=word/document.xml><?xml version="1.0" encoding="utf-8"?>
-<w:document xmlns:wpc="http://schemas.microsoft.com/office/word/2010/wordprocessingCanvas" xmlns:cx="http://schemas.microsoft.com/office/drawing/2014/chartex" xmlns:cx1="http://schemas.microsoft.com/office/drawing/2015/9/8/chartex" xmlns:cx2="http://schemas.microsoft.com/office/drawing/2015/10/21/chartex" xmlns:cx3="http://schemas.microsoft.com/office/drawing/2016/5/9/chartex" xmlns:cx4="http://schemas.microsoft.com/office/drawing/2016/5/10/chartex" xmlns:cx5="http://schemas.microsoft.com/office/drawing/2016/5/11/chartex" xmlns:cx6="http://schemas.microsoft.com/office/drawing/2016/5/12/chartex" xmlns:cx7="http://schemas.microsoft.com/office/drawing/2016/5/13/chartex" xmlns:cx8="http://schemas.microsoft.com/office/drawing/2016/5/14/chartex" xmlns:mc="http://schemas.openxmlformats.org/markup-compatibility/2006" xmlns:aink="http://schemas.microsoft.com/office/drawing/2016/ink" xmlns:am3d="http://schemas.microsoft.com/office/drawing/2017/model3d" xmlns:o="urn:schemas-microsoft-com:office:office" xmlns:r="http://schemas.openxmlformats.org/officeDocument/2006/relationships" xmlns:m="http://schemas.openxmlformats.org/officeDocument/2006/math" xmlns:v="urn:schemas-microsoft-com:vml" xmlns:wp14="http://schemas.microsoft.com/office/word/2010/wordprocessingDrawing" xmlns:wp="http://schemas.openxmlformats.org/drawingml/2006/wordprocessingDrawing" xmlns:w10="urn:schemas-microsoft-com:office:word" xmlns:w="http://schemas.openxmlformats.org/wordprocessingml/2006/main" xmlns:w14="http://schemas.microsoft.com/office/word/2010/wordml" xmlns:w15="http://schemas.microsoft.com/office/word/2012/wordml" xmlns:w16cex="http://schemas.microsoft.com/office/word/2018/wordml/cex" xmlns:w16cid="http://schemas.microsoft.com/office/word/2016/wordml/cid" xmlns:w16="http://schemas.microsoft.com/office/word/2018/wordml" xmlns:w16sdtdh="http://schemas.microsoft.com/office/word/2020/wordml/sdtdatahash" xmlns:w16se="http://schemas.microsoft.com/office/word/2015/wordml/symex" xmlns:wpg="http://schemas.microsoft.com/office/word/2010/wordprocessingGroup" xmlns:wpi="http://schemas.microsoft.com/office/word/2010/wordprocessingInk" xmlns:wne="http://schemas.microsoft.com/office/word/2006/wordml" xmlns:wps="http://schemas.microsoft.com/office/word/2010/wordprocessingShape" mc:Ignorable="w14 w15 w16se w16cid w16 w16cex w16sdtdh wp14">
+<w:document xmlns:wpc="http://schemas.microsoft.com/office/word/2010/wordprocessingCanvas" xmlns:cx="http://schemas.microsoft.com/office/drawing/2014/chartex" xmlns:cx1="http://schemas.microsoft.com/office/drawing/2015/9/8/chartex" xmlns:cx2="http://schemas.microsoft.com/office/drawing/2015/10/21/chartex" xmlns:cx3="http://schemas.microsoft.com/office/drawing/2016/5/9/chartex" xmlns:cx4="http://schemas.microsoft.com/office/drawing/2016/5/10/chartex" xmlns:cx5="http://schemas.microsoft.com/office/drawing/2016/5/11/chartex" xmlns:cx6="http://schemas.microsoft.com/office/drawing/2016/5/12/chartex" xmlns:cx7="http://schemas.microsoft.com/office/drawing/2016/5/13/chartex" xmlns:cx8="http://schemas.microsoft.com/office/drawing/2016/5/14/chartex" xmlns:mc="http://schemas.openxmlformats.org/markup-compatibility/2006" xmlns:aink="http://schemas.microsoft.com/office/drawing/2016/ink" xmlns:am3d="http://schemas.microsoft.com/office/drawing/2017/model3d" xmlns:o="urn:schemas-microsoft-com:office:office" xmlns:oel="http://schemas.microsoft.com/office/2019/extlst" xmlns:r="http://schemas.openxmlformats.org/officeDocument/2006/relationships" xmlns:m="http://schemas.openxmlformats.org/officeDocument/2006/math" xmlns:v="urn:schemas-microsoft-com:vml" xmlns:wp14="http://schemas.microsoft.com/office/word/2010/wordprocessingDrawing" xmlns:wp="http://schemas.openxmlformats.org/drawingml/2006/wordprocessingDrawing" xmlns:w10="urn:schemas-microsoft-com:office:word" xmlns:w="http://schemas.openxmlformats.org/wordprocessingml/2006/main" xmlns:w14="http://schemas.microsoft.com/office/word/2010/wordml" xmlns:w15="http://schemas.microsoft.com/office/word/2012/wordml" xmlns:w16cex="http://schemas.microsoft.com/office/word/2018/wordml/cex" xmlns:w16cid="http://schemas.microsoft.com/office/word/2016/wordml/cid" xmlns:w16="http://schemas.microsoft.com/office/word/2018/wordml" xmlns:w16du="http://schemas.microsoft.com/office/word/2023/wordml/word16du" xmlns:w16sdtdh="http://schemas.microsoft.com/office/word/2020/wordml/sdtdatahash" xmlns:w16se="http://schemas.microsoft.com/office/word/2015/wordml/symex" xmlns:wpg="http://schemas.microsoft.com/office/word/2010/wordprocessingGroup" xmlns:wpi="http://schemas.microsoft.com/office/word/2010/wordprocessingInk" xmlns:wne="http://schemas.microsoft.com/office/word/2006/wordml" xmlns:wps="http://schemas.microsoft.com/office/word/2010/wordprocessingShape" mc:Ignorable="w14 w15 w16se w16cid w16 w16cex w16sdtdh w16du wp14">
   <w:body>
     <w:p>
       <w:pPr>
@@ -2180,6 +2180,44 @@
             <w:tcW w:w="3114" w:type="dxa"/>
           </w:tcPr>
           <w:p>
+            <w:pPr>
+              <w:rPr>
+                <w:b/>
+              </w:rPr>
+            </w:pPr>
+          </w:p>
+        </w:tc>
+        <w:tc>
+          <w:tcPr>
+            <w:tcW w:w="2693" w:type="dxa"/>
+          </w:tcPr>
+          <w:p>
+            <w:pPr>
+              <w:rPr>
+                <w:u w:val="single"/>
+              </w:rPr>
+            </w:pPr>
+            <w:r>
+              <w:rPr>
+                <w:u w:val="single"/>
+              </w:rPr>
+              <w:t xml:space="preserve">Model viewer </w:t>
+            </w:r>
+          </w:p>
+        </w:tc>
+        <w:tc>
+          <w:tcPr>
+            <w:tcW w:w="3260" w:type="dxa"/>
+          </w:tcPr>
+          <w:p/>
+        </w:tc>
+      </w:tr>
+      <w:tr>
+        <w:tc>
+          <w:tcPr>
+            <w:tcW w:w="3114" w:type="dxa"/>
+          </w:tcPr>
+          <w:p>
             <w:r>
               <w:t>Any questions from the sponsor to us?</w:t>
             </w:r>
@@ -2215,7 +2253,7 @@
 </file>
 
 <file path=word/endnotes.xml><?xml version="1.0" encoding="utf-8"?>
-<w:endnotes xmlns:wpc="http://schemas.microsoft.com/office/word/2010/wordprocessingCanvas" xmlns:cx="http://schemas.microsoft.com/office/drawing/2014/chartex" xmlns:cx1="http://schemas.microsoft.com/office/drawing/2015/9/8/chartex" xmlns:cx2="http://schemas.microsoft.com/office/drawing/2015/10/21/chartex" xmlns:cx3="http://schemas.microsoft.com/office/drawing/2016/5/9/chartex" xmlns:cx4="http://schemas.microsoft.com/office/drawing/2016/5/10/chartex" xmlns:cx5="http://schemas.microsoft.com/office/drawing/2016/5/11/chartex" xmlns:cx6="http://schemas.microsoft.com/office/drawing/2016/5/12/chartex" xmlns:cx7="http://schemas.microsoft.com/office/drawing/2016/5/13/chartex" xmlns:cx8="http://schemas.microsoft.com/office/drawing/2016/5/14/chartex" xmlns:mc="http://schemas.openxmlformats.org/markup-compatibility/2006" xmlns:aink="http://schemas.microsoft.com/office/drawing/2016/ink" xmlns:am3d="http://schemas.microsoft.com/office/drawing/2017/model3d" xmlns:o="urn:schemas-microsoft-com:office:office" xmlns:r="http://schemas.openxmlformats.org/officeDocument/2006/relationships" xmlns:m="http://schemas.openxmlformats.org/officeDocument/2006/math" xmlns:v="urn:schemas-microsoft-com:vml" xmlns:wp14="http://schemas.microsoft.com/office/word/2010/wordprocessingDrawing" xmlns:wp="http://schemas.openxmlformats.org/drawingml/2006/wordprocessingDrawing" xmlns:w10="urn:schemas-microsoft-com:office:word" xmlns:w="http://schemas.openxmlformats.org/wordprocessingml/2006/main" xmlns:w14="http://schemas.microsoft.com/office/word/2010/wordml" xmlns:w15="http://schemas.microsoft.com/office/word/2012/wordml" xmlns:w16cex="http://schemas.microsoft.com/office/word/2018/wordml/cex" xmlns:w16cid="http://schemas.microsoft.com/office/word/2016/wordml/cid" xmlns:w16="http://schemas.microsoft.com/office/word/2018/wordml" xmlns:w16sdtdh="http://schemas.microsoft.com/office/word/2020/wordml/sdtdatahash" xmlns:w16se="http://schemas.microsoft.com/office/word/2015/wordml/symex" xmlns:wpg="http://schemas.microsoft.com/office/word/2010/wordprocessingGroup" xmlns:wpi="http://schemas.microsoft.com/office/word/2010/wordprocessingInk" xmlns:wne="http://schemas.microsoft.com/office/word/2006/wordml" xmlns:wps="http://schemas.microsoft.com/office/word/2010/wordprocessingShape" mc:Ignorable="w14 w15 w16se w16cid w16 w16cex w16sdtdh wp14">
+<w:endnotes xmlns:wpc="http://schemas.microsoft.com/office/word/2010/wordprocessingCanvas" xmlns:cx="http://schemas.microsoft.com/office/drawing/2014/chartex" xmlns:cx1="http://schemas.microsoft.com/office/drawing/2015/9/8/chartex" xmlns:cx2="http://schemas.microsoft.com/office/drawing/2015/10/21/chartex" xmlns:cx3="http://schemas.microsoft.com/office/drawing/2016/5/9/chartex" xmlns:cx4="http://schemas.microsoft.com/office/drawing/2016/5/10/chartex" xmlns:cx5="http://schemas.microsoft.com/office/drawing/2016/5/11/chartex" xmlns:cx6="http://schemas.microsoft.com/office/drawing/2016/5/12/chartex" xmlns:cx7="http://schemas.microsoft.com/office/drawing/2016/5/13/chartex" xmlns:cx8="http://schemas.microsoft.com/office/drawing/2016/5/14/chartex" xmlns:mc="http://schemas.openxmlformats.org/markup-compatibility/2006" xmlns:aink="http://schemas.microsoft.com/office/drawing/2016/ink" xmlns:am3d="http://schemas.microsoft.com/office/drawing/2017/model3d" xmlns:o="urn:schemas-microsoft-com:office:office" xmlns:oel="http://schemas.microsoft.com/office/2019/extlst" xmlns:r="http://schemas.openxmlformats.org/officeDocument/2006/relationships" xmlns:m="http://schemas.openxmlformats.org/officeDocument/2006/math" xmlns:v="urn:schemas-microsoft-com:vml" xmlns:wp14="http://schemas.microsoft.com/office/word/2010/wordprocessingDrawing" xmlns:wp="http://schemas.openxmlformats.org/drawingml/2006/wordprocessingDrawing" xmlns:w10="urn:schemas-microsoft-com:office:word" xmlns:w="http://schemas.openxmlformats.org/wordprocessingml/2006/main" xmlns:w14="http://schemas.microsoft.com/office/word/2010/wordml" xmlns:w15="http://schemas.microsoft.com/office/word/2012/wordml" xmlns:w16cex="http://schemas.microsoft.com/office/word/2018/wordml/cex" xmlns:w16cid="http://schemas.microsoft.com/office/word/2016/wordml/cid" xmlns:w16="http://schemas.microsoft.com/office/word/2018/wordml" xmlns:w16du="http://schemas.microsoft.com/office/word/2023/wordml/word16du" xmlns:w16sdtdh="http://schemas.microsoft.com/office/word/2020/wordml/sdtdatahash" xmlns:w16se="http://schemas.microsoft.com/office/word/2015/wordml/symex" xmlns:wpg="http://schemas.microsoft.com/office/word/2010/wordprocessingGroup" xmlns:wpi="http://schemas.microsoft.com/office/word/2010/wordprocessingInk" xmlns:wne="http://schemas.microsoft.com/office/word/2006/wordml" xmlns:wps="http://schemas.microsoft.com/office/word/2010/wordprocessingShape" mc:Ignorable="w14 w15 w16se w16cid w16 w16cex w16sdtdh w16du wp14">
   <w:endnote w:type="separator" w:id="-1">
     <w:p>
       <w:pPr>
@@ -2247,7 +2285,7 @@
 </file>
 
 <file path=word/footnotes.xml><?xml version="1.0" encoding="utf-8"?>
-<w:footnotes xmlns:wpc="http://schemas.microsoft.com/office/word/2010/wordprocessingCanvas" xmlns:cx="http://schemas.microsoft.com/office/drawing/2014/chartex" xmlns:cx1="http://schemas.microsoft.com/office/drawing/2015/9/8/chartex" xmlns:cx2="http://schemas.microsoft.com/office/drawing/2015/10/21/chartex" xmlns:cx3="http://schemas.microsoft.com/office/drawing/2016/5/9/chartex" xmlns:cx4="http://schemas.microsoft.com/office/drawing/2016/5/10/chartex" xmlns:cx5="http://schemas.microsoft.com/office/drawing/2016/5/11/chartex" xmlns:cx6="http://schemas.microsoft.com/office/drawing/2016/5/12/chartex" xmlns:cx7="http://schemas.microsoft.com/office/drawing/2016/5/13/chartex" xmlns:cx8="http://schemas.microsoft.com/office/drawing/2016/5/14/chartex" xmlns:mc="http://schemas.openxmlformats.org/markup-compatibility/2006" xmlns:aink="http://schemas.microsoft.com/office/drawing/2016/ink" xmlns:am3d="http://schemas.microsoft.com/office/drawing/2017/model3d" xmlns:o="urn:schemas-microsoft-com:office:office" xmlns:r="http://schemas.openxmlformats.org/officeDocument/2006/relationships" xmlns:m="http://schemas.openxmlformats.org/officeDocument/2006/math" xmlns:v="urn:schemas-microsoft-com:vml" xmlns:wp14="http://schemas.microsoft.com/office/word/2010/wordprocessingDrawing" xmlns:wp="http://schemas.openxmlformats.org/drawingml/2006/wordprocessingDrawing" xmlns:w10="urn:schemas-microsoft-com:office:word" xmlns:w="http://schemas.openxmlformats.org/wordprocessingml/2006/main" xmlns:w14="http://schemas.microsoft.com/office/word/2010/wordml" xmlns:w15="http://schemas.microsoft.com/office/word/2012/wordml" xmlns:w16cex="http://schemas.microsoft.com/office/word/2018/wordml/cex" xmlns:w16cid="http://schemas.microsoft.com/office/word/2016/wordml/cid" xmlns:w16="http://schemas.microsoft.com/office/word/2018/wordml" xmlns:w16sdtdh="http://schemas.microsoft.com/office/word/2020/wordml/sdtdatahash" xmlns:w16se="http://schemas.microsoft.com/office/word/2015/wordml/symex" xmlns:wpg="http://schemas.microsoft.com/office/word/2010/wordprocessingGroup" xmlns:wpi="http://schemas.microsoft.com/office/word/2010/wordprocessingInk" xmlns:wne="http://schemas.microsoft.com/office/word/2006/wordml" xmlns:wps="http://schemas.microsoft.com/office/word/2010/wordprocessingShape" mc:Ignorable="w14 w15 w16se w16cid w16 w16cex w16sdtdh wp14">
+<w:footnotes xmlns:wpc="http://schemas.microsoft.com/office/word/2010/wordprocessingCanvas" xmlns:cx="http://schemas.microsoft.com/office/drawing/2014/chartex" xmlns:cx1="http://schemas.microsoft.com/office/drawing/2015/9/8/chartex" xmlns:cx2="http://schemas.microsoft.com/office/drawing/2015/10/21/chartex" xmlns:cx3="http://schemas.microsoft.com/office/drawing/2016/5/9/chartex" xmlns:cx4="http://schemas.microsoft.com/office/drawing/2016/5/10/chartex" xmlns:cx5="http://schemas.microsoft.com/office/drawing/2016/5/11/chartex" xmlns:cx6="http://schemas.microsoft.com/office/drawing/2016/5/12/chartex" xmlns:cx7="http://schemas.microsoft.com/office/drawing/2016/5/13/chartex" xmlns:cx8="http://schemas.microsoft.com/office/drawing/2016/5/14/chartex" xmlns:mc="http://schemas.openxmlformats.org/markup-compatibility/2006" xmlns:aink="http://schemas.microsoft.com/office/drawing/2016/ink" xmlns:am3d="http://schemas.microsoft.com/office/drawing/2017/model3d" xmlns:o="urn:schemas-microsoft-com:office:office" xmlns:oel="http://schemas.microsoft.com/office/2019/extlst" xmlns:r="http://schemas.openxmlformats.org/officeDocument/2006/relationships" xmlns:m="http://schemas.openxmlformats.org/officeDocument/2006/math" xmlns:v="urn:schemas-microsoft-com:vml" xmlns:wp14="http://schemas.microsoft.com/office/word/2010/wordprocessingDrawing" xmlns:wp="http://schemas.openxmlformats.org/drawingml/2006/wordprocessingDrawing" xmlns:w10="urn:schemas-microsoft-com:office:word" xmlns:w="http://schemas.openxmlformats.org/wordprocessingml/2006/main" xmlns:w14="http://schemas.microsoft.com/office/word/2010/wordml" xmlns:w15="http://schemas.microsoft.com/office/word/2012/wordml" xmlns:w16cex="http://schemas.microsoft.com/office/word/2018/wordml/cex" xmlns:w16cid="http://schemas.microsoft.com/office/word/2016/wordml/cid" xmlns:w16="http://schemas.microsoft.com/office/word/2018/wordml" xmlns:w16du="http://schemas.microsoft.com/office/word/2023/wordml/word16du" xmlns:w16sdtdh="http://schemas.microsoft.com/office/word/2020/wordml/sdtdatahash" xmlns:w16se="http://schemas.microsoft.com/office/word/2015/wordml/symex" xmlns:wpg="http://schemas.microsoft.com/office/word/2010/wordprocessingGroup" xmlns:wpi="http://schemas.microsoft.com/office/word/2010/wordprocessingInk" xmlns:wne="http://schemas.microsoft.com/office/word/2006/wordml" xmlns:wps="http://schemas.microsoft.com/office/word/2010/wordprocessingShape" mc:Ignorable="w14 w15 w16se w16cid w16 w16cex w16sdtdh w16du wp14">
   <w:footnote w:type="separator" w:id="-1">
     <w:p>
       <w:pPr>
@@ -2279,7 +2317,7 @@
 </file>
 
 <file path=word/numbering.xml><?xml version="1.0" encoding="utf-8"?>
-<w:numbering xmlns:wpc="http://schemas.microsoft.com/office/word/2010/wordprocessingCanvas" xmlns:cx="http://schemas.microsoft.com/office/drawing/2014/chartex" xmlns:cx1="http://schemas.microsoft.com/office/drawing/2015/9/8/chartex" xmlns:cx2="http://schemas.microsoft.com/office/drawing/2015/10/21/chartex" xmlns:cx3="http://schemas.microsoft.com/office/drawing/2016/5/9/chartex" xmlns:cx4="http://schemas.microsoft.com/office/drawing/2016/5/10/chartex" xmlns:cx5="http://schemas.microsoft.com/office/drawing/2016/5/11/chartex" xmlns:cx6="http://schemas.microsoft.com/office/drawing/2016/5/12/chartex" xmlns:cx7="http://schemas.microsoft.com/office/drawing/2016/5/13/chartex" xmlns:cx8="http://schemas.microsoft.com/office/drawing/2016/5/14/chartex" xmlns:mc="http://schemas.openxmlformats.org/markup-compatibility/2006" xmlns:aink="http://schemas.microsoft.com/office/drawing/2016/ink" xmlns:am3d="http://schemas.microsoft.com/office/drawing/2017/model3d" xmlns:o="urn:schemas-microsoft-com:office:office" xmlns:r="http://schemas.openxmlformats.org/officeDocument/2006/relationships" xmlns:m="http://schemas.openxmlformats.org/officeDocument/2006/math" xmlns:v="urn:schemas-microsoft-com:vml" xmlns:wp14="http://schemas.microsoft.com/office/word/2010/wordprocessingDrawing" xmlns:wp="http://schemas.openxmlformats.org/drawingml/2006/wordprocessingDrawing" xmlns:w10="urn:schemas-microsoft-com:office:word" xmlns:w="http://schemas.openxmlformats.org/wordprocessingml/2006/main" xmlns:w14="http://schemas.microsoft.com/office/word/2010/wordml" xmlns:w15="http://schemas.microsoft.com/office/word/2012/wordml" xmlns:w16cex="http://schemas.microsoft.com/office/word/2018/wordml/cex" xmlns:w16cid="http://schemas.microsoft.com/office/word/2016/wordml/cid" xmlns:w16="http://schemas.microsoft.com/office/word/2018/wordml" xmlns:w16sdtdh="http://schemas.microsoft.com/office/word/2020/wordml/sdtdatahash" xmlns:w16se="http://schemas.microsoft.com/office/word/2015/wordml/symex" xmlns:wpg="http://schemas.microsoft.com/office/word/2010/wordprocessingGroup" xmlns:wpi="http://schemas.microsoft.com/office/word/2010/wordprocessingInk" xmlns:wne="http://schemas.microsoft.com/office/word/2006/wordml" xmlns:wps="http://schemas.microsoft.com/office/word/2010/wordprocessingShape" mc:Ignorable="w14 w15 w16se w16cid w16 w16cex w16sdtdh wp14">
+<w:numbering xmlns:wpc="http://schemas.microsoft.com/office/word/2010/wordprocessingCanvas" xmlns:cx="http://schemas.microsoft.com/office/drawing/2014/chartex" xmlns:cx1="http://schemas.microsoft.com/office/drawing/2015/9/8/chartex" xmlns:cx2="http://schemas.microsoft.com/office/drawing/2015/10/21/chartex" xmlns:cx3="http://schemas.microsoft.com/office/drawing/2016/5/9/chartex" xmlns:cx4="http://schemas.microsoft.com/office/drawing/2016/5/10/chartex" xmlns:cx5="http://schemas.microsoft.com/office/drawing/2016/5/11/chartex" xmlns:cx6="http://schemas.microsoft.com/office/drawing/2016/5/12/chartex" xmlns:cx7="http://schemas.microsoft.com/office/drawing/2016/5/13/chartex" xmlns:cx8="http://schemas.microsoft.com/office/drawing/2016/5/14/chartex" xmlns:mc="http://schemas.openxmlformats.org/markup-compatibility/2006" xmlns:aink="http://schemas.microsoft.com/office/drawing/2016/ink" xmlns:am3d="http://schemas.microsoft.com/office/drawing/2017/model3d" xmlns:o="urn:schemas-microsoft-com:office:office" xmlns:oel="http://schemas.microsoft.com/office/2019/extlst" xmlns:r="http://schemas.openxmlformats.org/officeDocument/2006/relationships" xmlns:m="http://schemas.openxmlformats.org/officeDocument/2006/math" xmlns:v="urn:schemas-microsoft-com:vml" xmlns:wp14="http://schemas.microsoft.com/office/word/2010/wordprocessingDrawing" xmlns:wp="http://schemas.openxmlformats.org/drawingml/2006/wordprocessingDrawing" xmlns:w10="urn:schemas-microsoft-com:office:word" xmlns:w="http://schemas.openxmlformats.org/wordprocessingml/2006/main" xmlns:w14="http://schemas.microsoft.com/office/word/2010/wordml" xmlns:w15="http://schemas.microsoft.com/office/word/2012/wordml" xmlns:w16cex="http://schemas.microsoft.com/office/word/2018/wordml/cex" xmlns:w16cid="http://schemas.microsoft.com/office/word/2016/wordml/cid" xmlns:w16="http://schemas.microsoft.com/office/word/2018/wordml" xmlns:w16du="http://schemas.microsoft.com/office/word/2023/wordml/word16du" xmlns:w16sdtdh="http://schemas.microsoft.com/office/word/2020/wordml/sdtdatahash" xmlns:w16se="http://schemas.microsoft.com/office/word/2015/wordml/symex" xmlns:wpg="http://schemas.microsoft.com/office/word/2010/wordprocessingGroup" xmlns:wpi="http://schemas.microsoft.com/office/word/2010/wordprocessingInk" xmlns:wne="http://schemas.microsoft.com/office/word/2006/wordml" xmlns:wps="http://schemas.microsoft.com/office/word/2010/wordprocessingShape" mc:Ignorable="w14 w15 w16se w16cid w16 w16cex w16sdtdh w16du wp14">
   <w:abstractNum w:abstractNumId="0" w15:restartNumberingAfterBreak="0">
     <w:nsid w:val="00597B9C"/>
     <w:multiLevelType w:val="hybridMultilevel"/>
@@ -5172,98 +5210,98 @@
       </w:rPr>
     </w:lvl>
   </w:abstractNum>
-  <w:num w:numId="1">
+  <w:num w:numId="1" w16cid:durableId="345060740">
     <w:abstractNumId w:val="14"/>
   </w:num>
-  <w:num w:numId="2">
+  <w:num w:numId="2" w16cid:durableId="1189832661">
     <w:abstractNumId w:val="13"/>
   </w:num>
-  <w:num w:numId="3">
+  <w:num w:numId="3" w16cid:durableId="1130325083">
     <w:abstractNumId w:val="28"/>
   </w:num>
-  <w:num w:numId="4">
+  <w:num w:numId="4" w16cid:durableId="898176502">
     <w:abstractNumId w:val="22"/>
   </w:num>
-  <w:num w:numId="5">
+  <w:num w:numId="5" w16cid:durableId="851140506">
     <w:abstractNumId w:val="27"/>
   </w:num>
-  <w:num w:numId="6">
+  <w:num w:numId="6" w16cid:durableId="519858802">
     <w:abstractNumId w:val="19"/>
   </w:num>
-  <w:num w:numId="7">
+  <w:num w:numId="7" w16cid:durableId="984047861">
     <w:abstractNumId w:val="24"/>
   </w:num>
-  <w:num w:numId="8">
+  <w:num w:numId="8" w16cid:durableId="1868249782">
     <w:abstractNumId w:val="6"/>
   </w:num>
-  <w:num w:numId="9">
+  <w:num w:numId="9" w16cid:durableId="1985310646">
     <w:abstractNumId w:val="8"/>
   </w:num>
-  <w:num w:numId="10">
+  <w:num w:numId="10" w16cid:durableId="119148364">
     <w:abstractNumId w:val="9"/>
   </w:num>
-  <w:num w:numId="11">
+  <w:num w:numId="11" w16cid:durableId="74668555">
     <w:abstractNumId w:val="26"/>
   </w:num>
-  <w:num w:numId="12">
+  <w:num w:numId="12" w16cid:durableId="1315179848">
     <w:abstractNumId w:val="25"/>
   </w:num>
-  <w:num w:numId="13">
+  <w:num w:numId="13" w16cid:durableId="1575313662">
     <w:abstractNumId w:val="23"/>
   </w:num>
-  <w:num w:numId="14">
+  <w:num w:numId="14" w16cid:durableId="1750233288">
     <w:abstractNumId w:val="1"/>
   </w:num>
-  <w:num w:numId="15">
+  <w:num w:numId="15" w16cid:durableId="1250692933">
     <w:abstractNumId w:val="3"/>
   </w:num>
-  <w:num w:numId="16">
+  <w:num w:numId="16" w16cid:durableId="1272128125">
     <w:abstractNumId w:val="0"/>
   </w:num>
-  <w:num w:numId="17">
+  <w:num w:numId="17" w16cid:durableId="1746604892">
     <w:abstractNumId w:val="7"/>
   </w:num>
-  <w:num w:numId="18">
+  <w:num w:numId="18" w16cid:durableId="230048276">
     <w:abstractNumId w:val="10"/>
   </w:num>
-  <w:num w:numId="19">
+  <w:num w:numId="19" w16cid:durableId="1482699333">
     <w:abstractNumId w:val="16"/>
   </w:num>
-  <w:num w:numId="20">
+  <w:num w:numId="20" w16cid:durableId="308289850">
     <w:abstractNumId w:val="15"/>
   </w:num>
-  <w:num w:numId="21">
+  <w:num w:numId="21" w16cid:durableId="2075618717">
     <w:abstractNumId w:val="4"/>
   </w:num>
-  <w:num w:numId="22">
+  <w:num w:numId="22" w16cid:durableId="1666470697">
     <w:abstractNumId w:val="12"/>
   </w:num>
-  <w:num w:numId="23">
+  <w:num w:numId="23" w16cid:durableId="2038962555">
     <w:abstractNumId w:val="20"/>
   </w:num>
-  <w:num w:numId="24">
+  <w:num w:numId="24" w16cid:durableId="963971124">
     <w:abstractNumId w:val="17"/>
   </w:num>
-  <w:num w:numId="25">
+  <w:num w:numId="25" w16cid:durableId="631398708">
     <w:abstractNumId w:val="18"/>
   </w:num>
-  <w:num w:numId="26">
+  <w:num w:numId="26" w16cid:durableId="346173069">
     <w:abstractNumId w:val="2"/>
   </w:num>
-  <w:num w:numId="27">
+  <w:num w:numId="27" w16cid:durableId="328287545">
     <w:abstractNumId w:val="21"/>
   </w:num>
-  <w:num w:numId="28">
+  <w:num w:numId="28" w16cid:durableId="1854101718">
     <w:abstractNumId w:val="11"/>
   </w:num>
-  <w:num w:numId="29">
+  <w:num w:numId="29" w16cid:durableId="936519515">
     <w:abstractNumId w:val="5"/>
   </w:num>
 </w:numbering>
 </file>
 
 <file path=word/styles.xml><?xml version="1.0" encoding="utf-8"?>
-<w:styles xmlns:mc="http://schemas.openxmlformats.org/markup-compatibility/2006" xmlns:r="http://schemas.openxmlformats.org/officeDocument/2006/relationships" xmlns:w="http://schemas.openxmlformats.org/wordprocessingml/2006/main" xmlns:w14="http://schemas.microsoft.com/office/word/2010/wordml" xmlns:w15="http://schemas.microsoft.com/office/word/2012/wordml" xmlns:w16cex="http://schemas.microsoft.com/office/word/2018/wordml/cex" xmlns:w16cid="http://schemas.microsoft.com/office/word/2016/wordml/cid" xmlns:w16="http://schemas.microsoft.com/office/word/2018/wordml" xmlns:w16sdtdh="http://schemas.microsoft.com/office/word/2020/wordml/sdtdatahash" xmlns:w16se="http://schemas.microsoft.com/office/word/2015/wordml/symex" mc:Ignorable="w14 w15 w16se w16cid w16 w16cex w16sdtdh">
+<w:styles xmlns:mc="http://schemas.openxmlformats.org/markup-compatibility/2006" xmlns:r="http://schemas.openxmlformats.org/officeDocument/2006/relationships" xmlns:w="http://schemas.openxmlformats.org/wordprocessingml/2006/main" xmlns:w14="http://schemas.microsoft.com/office/word/2010/wordml" xmlns:w15="http://schemas.microsoft.com/office/word/2012/wordml" xmlns:w16cex="http://schemas.microsoft.com/office/word/2018/wordml/cex" xmlns:w16cid="http://schemas.microsoft.com/office/word/2016/wordml/cid" xmlns:w16="http://schemas.microsoft.com/office/word/2018/wordml" xmlns:w16du="http://schemas.microsoft.com/office/word/2023/wordml/word16du" xmlns:w16sdtdh="http://schemas.microsoft.com/office/word/2020/wordml/sdtdatahash" xmlns:w16se="http://schemas.microsoft.com/office/word/2015/wordml/symex" mc:Ignorable="w14 w15 w16se w16cid w16 w16cex w16sdtdh w16du">
   <w:docDefaults>
     <w:rPrDefault>
       <w:rPr>
@@ -6549,9 +6587,33 @@
 </file>
 
 <file path=customXml/item2.xml><?xml version="1.0" encoding="utf-8"?>
-<ct:contentTypeSchema xmlns:ct="http://schemas.microsoft.com/office/2006/metadata/contentType" xmlns:ma="http://schemas.microsoft.com/office/2006/metadata/properties/metaAttributes" ct:_="" ma:_="" ma:contentTypeName="Document" ma:contentTypeID="0x0101001F513751AC33344AB32CFD2920EFE649" ma:contentTypeVersion="12" ma:contentTypeDescription="Create a new document." ma:contentTypeScope="" ma:versionID="0f6feadb6ddc3dd981964989ee73899f">
-  <xsd:schema xmlns:xsd="http://www.w3.org/2001/XMLSchema" xmlns:xs="http://www.w3.org/2001/XMLSchema" xmlns:p="http://schemas.microsoft.com/office/2006/metadata/properties" xmlns:ns2="72e3a154-4955-46c3-9573-e9dec3e1f195" xmlns:ns3="ec500478-62e0-46fc-87f1-cfa988e486b4" targetNamespace="http://schemas.microsoft.com/office/2006/metadata/properties" ma:root="true" ma:fieldsID="d9b71de754eeec595e1494c9b2c7a90b" ns2:_="" ns3:_="">
-    <xsd:import namespace="72e3a154-4955-46c3-9573-e9dec3e1f195"/>
+<b:Sources xmlns:b="http://schemas.openxmlformats.org/officeDocument/2006/bibliography" xmlns="http://schemas.openxmlformats.org/officeDocument/2006/bibliography" SelectedStyle="\APA.XSL" StyleName="APA"/>
+</file>
+
+<file path=customXml/item3.xml><?xml version="1.0" encoding="utf-8"?>
+<?mso-contentType ?>
+<FormTemplates xmlns="http://schemas.microsoft.com/sharepoint/v3/contenttype/forms">
+  <Display>DocumentLibraryForm</Display>
+  <Edit>DocumentLibraryForm</Edit>
+  <New>DocumentLibraryForm</New>
+</FormTemplates>
+</file>
+
+<file path=customXml/item4.xml><?xml version="1.0" encoding="utf-8"?>
+<p:properties xmlns:p="http://schemas.microsoft.com/office/2006/metadata/properties" xmlns:xsi="http://www.w3.org/2001/XMLSchema-instance" xmlns:pc="http://schemas.microsoft.com/office/infopath/2007/PartnerControls">
+  <documentManagement>
+    <TaxCatchAll xmlns="ec500478-62e0-46fc-87f1-cfa988e486b4" xsi:nil="true"/>
+    <lcf76f155ced4ddcb4097134ff3c332f xmlns="25bcabcf-d275-4206-9fb1-2f2d419cd22b">
+      <Terms xmlns="http://schemas.microsoft.com/office/infopath/2007/PartnerControls"/>
+    </lcf76f155ced4ddcb4097134ff3c332f>
+  </documentManagement>
+</p:properties>
+</file>
+
+<file path=customXml/item5.xml><?xml version="1.0" encoding="utf-8"?>
+<ct:contentTypeSchema xmlns:ct="http://schemas.microsoft.com/office/2006/metadata/contentType" xmlns:ma="http://schemas.microsoft.com/office/2006/metadata/properties/metaAttributes" ct:_="" ma:_="" ma:contentTypeName="Document" ma:contentTypeID="0x010100F041F74863103D4C9C3AA0A07291BB02" ma:contentTypeVersion="18" ma:contentTypeDescription="Create a new document." ma:contentTypeScope="" ma:versionID="45484b46a277026026ff9b53ca67925b">
+  <xsd:schema xmlns:xsd="http://www.w3.org/2001/XMLSchema" xmlns:xs="http://www.w3.org/2001/XMLSchema" xmlns:p="http://schemas.microsoft.com/office/2006/metadata/properties" xmlns:ns2="25bcabcf-d275-4206-9fb1-2f2d419cd22b" xmlns:ns3="ec500478-62e0-46fc-87f1-cfa988e486b4" targetNamespace="http://schemas.microsoft.com/office/2006/metadata/properties" ma:root="true" ma:fieldsID="52261f3f84922f81c6d5fc67edbfcfe9" ns2:_="" ns3:_="">
+    <xsd:import namespace="25bcabcf-d275-4206-9fb1-2f2d419cd22b"/>
     <xsd:import namespace="ec500478-62e0-46fc-87f1-cfa988e486b4"/>
     <xsd:element name="properties">
       <xsd:complexType>
@@ -6561,16 +6623,21 @@
               <xsd:all>
                 <xsd:element ref="ns2:MediaServiceMetadata" minOccurs="0"/>
                 <xsd:element ref="ns2:MediaServiceFastMetadata" minOccurs="0"/>
+                <xsd:element ref="ns3:SharedWithUsers" minOccurs="0"/>
+                <xsd:element ref="ns3:SharedWithDetails" minOccurs="0"/>
+                <xsd:element ref="ns2:MediaServiceAutoKeyPoints" minOccurs="0"/>
+                <xsd:element ref="ns2:MediaServiceKeyPoints" minOccurs="0"/>
+                <xsd:element ref="ns2:MediaServiceDateTaken" minOccurs="0"/>
                 <xsd:element ref="ns2:MediaServiceAutoTags" minOccurs="0"/>
                 <xsd:element ref="ns2:MediaServiceOCR" minOccurs="0"/>
                 <xsd:element ref="ns2:MediaServiceGenerationTime" minOccurs="0"/>
                 <xsd:element ref="ns2:MediaServiceEventHashCode" minOccurs="0"/>
-                <xsd:element ref="ns2:MediaServiceAutoKeyPoints" minOccurs="0"/>
-                <xsd:element ref="ns2:MediaServiceKeyPoints" minOccurs="0"/>
-                <xsd:element ref="ns3:SharedWithUsers" minOccurs="0"/>
-                <xsd:element ref="ns3:SharedWithDetails" minOccurs="0"/>
-                <xsd:element ref="ns2:MediaServiceDateTaken" minOccurs="0"/>
+                <xsd:element ref="ns2:MediaServiceLocation" minOccurs="0"/>
+                <xsd:element ref="ns2:lcf76f155ced4ddcb4097134ff3c332f" minOccurs="0"/>
+                <xsd:element ref="ns3:TaxCatchAll" minOccurs="0"/>
                 <xsd:element ref="ns2:MediaLengthInSeconds" minOccurs="0"/>
+                <xsd:element ref="ns2:MediaServiceObjectDetectorVersions" minOccurs="0"/>
+                <xsd:element ref="ns2:MediaServiceSearchProperties" minOccurs="0"/>
               </xsd:all>
             </xsd:complexType>
           </xsd:element>
@@ -6578,7 +6645,7 @@
       </xsd:complexType>
     </xsd:element>
   </xsd:schema>
-  <xsd:schema xmlns:xsd="http://www.w3.org/2001/XMLSchema" xmlns:xs="http://www.w3.org/2001/XMLSchema" xmlns:dms="http://schemas.microsoft.com/office/2006/documentManagement/types" xmlns:pc="http://schemas.microsoft.com/office/infopath/2007/PartnerControls" targetNamespace="72e3a154-4955-46c3-9573-e9dec3e1f195" elementFormDefault="qualified">
+  <xsd:schema xmlns:xsd="http://www.w3.org/2001/XMLSchema" xmlns:xs="http://www.w3.org/2001/XMLSchema" xmlns:dms="http://schemas.microsoft.com/office/2006/documentManagement/types" xmlns:pc="http://schemas.microsoft.com/office/infopath/2007/PartnerControls" targetNamespace="25bcabcf-d275-4206-9fb1-2f2d419cd22b" elementFormDefault="qualified">
     <xsd:import namespace="http://schemas.microsoft.com/office/2006/documentManagement/types"/>
     <xsd:import namespace="http://schemas.microsoft.com/office/infopath/2007/PartnerControls"/>
     <xsd:element name="MediaServiceMetadata" ma:index="8" nillable="true" ma:displayName="MediaServiceMetadata" ma:hidden="true" ma:internalName="MediaServiceMetadata" ma:readOnly="true">
@@ -6591,55 +6658,77 @@
         <xsd:restriction base="dms:Note"/>
       </xsd:simpleType>
     </xsd:element>
-    <xsd:element name="MediaServiceAutoTags" ma:index="10" nillable="true" ma:displayName="Tags" ma:internalName="MediaServiceAutoTags" ma:readOnly="true">
+    <xsd:element name="MediaServiceAutoKeyPoints" ma:index="12" nillable="true" ma:displayName="MediaServiceAutoKeyPoints" ma:hidden="true" ma:internalName="MediaServiceAutoKeyPoints" ma:readOnly="true">
       <xsd:simpleType>
-        <xsd:restriction base="dms:Text"/>
+        <xsd:restriction base="dms:Note"/>
       </xsd:simpleType>
     </xsd:element>
-    <xsd:element name="MediaServiceOCR" ma:index="11" nillable="true" ma:displayName="Extracted Text" ma:internalName="MediaServiceOCR" ma:readOnly="true">
+    <xsd:element name="MediaServiceKeyPoints" ma:index="13" nillable="true" ma:displayName="KeyPoints" ma:internalName="MediaServiceKeyPoints" ma:readOnly="true">
       <xsd:simpleType>
         <xsd:restriction base="dms:Note">
           <xsd:maxLength value="255"/>
         </xsd:restriction>
       </xsd:simpleType>
     </xsd:element>
-    <xsd:element name="MediaServiceGenerationTime" ma:index="12" nillable="true" ma:displayName="MediaServiceGenerationTime" ma:hidden="true" ma:internalName="MediaServiceGenerationTime" ma:readOnly="true">
+    <xsd:element name="MediaServiceDateTaken" ma:index="14" nillable="true" ma:displayName="MediaServiceDateTaken" ma:hidden="true" ma:internalName="MediaServiceDateTaken" ma:readOnly="true">
       <xsd:simpleType>
         <xsd:restriction base="dms:Text"/>
       </xsd:simpleType>
     </xsd:element>
-    <xsd:element name="MediaServiceEventHashCode" ma:index="13" nillable="true" ma:displayName="MediaServiceEventHashCode" ma:hidden="true" ma:internalName="MediaServiceEventHashCode" ma:readOnly="true">
+    <xsd:element name="MediaServiceAutoTags" ma:index="15" nillable="true" ma:displayName="Tags" ma:internalName="MediaServiceAutoTags" ma:readOnly="true">
       <xsd:simpleType>
         <xsd:restriction base="dms:Text"/>
       </xsd:simpleType>
     </xsd:element>
-    <xsd:element name="MediaServiceAutoKeyPoints" ma:index="14" nillable="true" ma:displayName="MediaServiceAutoKeyPoints" ma:hidden="true" ma:internalName="MediaServiceAutoKeyPoints" ma:readOnly="true">
-      <xsd:simpleType>
-        <xsd:restriction base="dms:Note"/>
-      </xsd:simpleType>
-    </xsd:element>
-    <xsd:element name="MediaServiceKeyPoints" ma:index="15" nillable="true" ma:displayName="KeyPoints" ma:internalName="MediaServiceKeyPoints" ma:readOnly="true">
+    <xsd:element name="MediaServiceOCR" ma:index="16" nillable="true" ma:displayName="Extracted Text" ma:internalName="MediaServiceOCR" ma:readOnly="true">
       <xsd:simpleType>
         <xsd:restriction base="dms:Note">
           <xsd:maxLength value="255"/>
         </xsd:restriction>
       </xsd:simpleType>
     </xsd:element>
-    <xsd:element name="MediaServiceDateTaken" ma:index="18" nillable="true" ma:displayName="MediaServiceDateTaken" ma:hidden="true" ma:internalName="MediaServiceDateTaken" ma:readOnly="true">
+    <xsd:element name="MediaServiceGenerationTime" ma:index="17" nillable="true" ma:displayName="MediaServiceGenerationTime" ma:hidden="true" ma:internalName="MediaServiceGenerationTime" ma:readOnly="true">
       <xsd:simpleType>
         <xsd:restriction base="dms:Text"/>
       </xsd:simpleType>
     </xsd:element>
-    <xsd:element name="MediaLengthInSeconds" ma:index="19" nillable="true" ma:displayName="Length (seconds)" ma:internalName="MediaLengthInSeconds" ma:readOnly="true">
+    <xsd:element name="MediaServiceEventHashCode" ma:index="18" nillable="true" ma:displayName="MediaServiceEventHashCode" ma:hidden="true" ma:internalName="MediaServiceEventHashCode" ma:readOnly="true">
+      <xsd:simpleType>
+        <xsd:restriction base="dms:Text"/>
+      </xsd:simpleType>
+    </xsd:element>
+    <xsd:element name="MediaServiceLocation" ma:index="19" nillable="true" ma:displayName="Location" ma:internalName="MediaServiceLocation" ma:readOnly="true">
+      <xsd:simpleType>
+        <xsd:restriction base="dms:Text"/>
+      </xsd:simpleType>
+    </xsd:element>
+    <xsd:element name="lcf76f155ced4ddcb4097134ff3c332f" ma:index="21" nillable="true" ma:taxonomy="true" ma:internalName="lcf76f155ced4ddcb4097134ff3c332f" ma:taxonomyFieldName="MediaServiceImageTags" ma:displayName="Image Tags" ma:readOnly="false" ma:fieldId="{5cf76f15-5ced-4ddc-b409-7134ff3c332f}" ma:taxonomyMulti="true" ma:sspId="7f35f27a-c890-4130-b78e-bbe546ff31bf" ma:termSetId="09814cd3-568e-fe90-9814-8d621ff8fb84" ma:anchorId="fba54fb3-c3e1-fe81-a776-ca4b69148c4d" ma:open="true" ma:isKeyword="false">
+      <xsd:complexType>
+        <xsd:sequence>
+          <xsd:element ref="pc:Terms" minOccurs="0" maxOccurs="1"/>
+        </xsd:sequence>
+      </xsd:complexType>
+    </xsd:element>
+    <xsd:element name="MediaLengthInSeconds" ma:index="23" nillable="true" ma:displayName="MediaLengthInSeconds" ma:hidden="true" ma:internalName="MediaLengthInSeconds" ma:readOnly="true">
       <xsd:simpleType>
         <xsd:restriction base="dms:Unknown"/>
+      </xsd:simpleType>
+    </xsd:element>
+    <xsd:element name="MediaServiceObjectDetectorVersions" ma:index="24" nillable="true" ma:displayName="MediaServiceObjectDetectorVersions" ma:hidden="true" ma:indexed="true" ma:internalName="MediaServiceObjectDetectorVersions" ma:readOnly="true">
+      <xsd:simpleType>
+        <xsd:restriction base="dms:Text"/>
+      </xsd:simpleType>
+    </xsd:element>
+    <xsd:element name="MediaServiceSearchProperties" ma:index="25" nillable="true" ma:displayName="MediaServiceSearchProperties" ma:hidden="true" ma:internalName="MediaServiceSearchProperties" ma:readOnly="true">
+      <xsd:simpleType>
+        <xsd:restriction base="dms:Note"/>
       </xsd:simpleType>
     </xsd:element>
   </xsd:schema>
   <xsd:schema xmlns:xsd="http://www.w3.org/2001/XMLSchema" xmlns:xs="http://www.w3.org/2001/XMLSchema" xmlns:dms="http://schemas.microsoft.com/office/2006/documentManagement/types" xmlns:pc="http://schemas.microsoft.com/office/infopath/2007/PartnerControls" targetNamespace="ec500478-62e0-46fc-87f1-cfa988e486b4" elementFormDefault="qualified">
     <xsd:import namespace="http://schemas.microsoft.com/office/2006/documentManagement/types"/>
     <xsd:import namespace="http://schemas.microsoft.com/office/infopath/2007/PartnerControls"/>
-    <xsd:element name="SharedWithUsers" ma:index="16" nillable="true" ma:displayName="Shared With" ma:internalName="SharedWithUsers" ma:readOnly="true">
+    <xsd:element name="SharedWithUsers" ma:index="10" nillable="true" ma:displayName="Shared With" ma:internalName="SharedWithUsers" ma:readOnly="true">
       <xsd:complexType>
         <xsd:complexContent>
           <xsd:extension base="dms:UserMulti">
@@ -6658,12 +6747,23 @@
         </xsd:complexContent>
       </xsd:complexType>
     </xsd:element>
-    <xsd:element name="SharedWithDetails" ma:index="17" nillable="true" ma:displayName="Shared With Details" ma:internalName="SharedWithDetails" ma:readOnly="true">
+    <xsd:element name="SharedWithDetails" ma:index="11" nillable="true" ma:displayName="Shared With Details" ma:internalName="SharedWithDetails" ma:readOnly="true">
       <xsd:simpleType>
         <xsd:restriction base="dms:Note">
           <xsd:maxLength value="255"/>
         </xsd:restriction>
       </xsd:simpleType>
+    </xsd:element>
+    <xsd:element name="TaxCatchAll" ma:index="22" nillable="true" ma:displayName="Taxonomy Catch All Column" ma:hidden="true" ma:list="{516b899e-718a-4501-bed1-5bdbb6269459}" ma:internalName="TaxCatchAll" ma:showField="CatchAllData" ma:web="ec500478-62e0-46fc-87f1-cfa988e486b4">
+      <xsd:complexType>
+        <xsd:complexContent>
+          <xsd:extension base="dms:MultiChoiceLookup">
+            <xsd:sequence>
+              <xsd:element name="Value" type="dms:Lookup" maxOccurs="unbounded" minOccurs="0" nillable="true"/>
+            </xsd:sequence>
+          </xsd:extension>
+        </xsd:complexContent>
+      </xsd:complexType>
     </xsd:element>
   </xsd:schema>
   <xsd:schema xmlns="http://schemas.openxmlformats.org/package/2006/metadata/core-properties" xmlns:xsd="http://www.w3.org/2001/XMLSchema" xmlns:xsi="http://www.w3.org/2001/XMLSchema-instance" xmlns:dc="http://purl.org/dc/elements/1.1/" xmlns:dcterms="http://purl.org/dc/terms/" xmlns:odoc="http://schemas.microsoft.com/internal/obd" targetNamespace="http://schemas.openxmlformats.org/package/2006/metadata/core-properties" elementFormDefault="qualified" attributeFormDefault="unqualified" blockDefault="#all">
@@ -6765,25 +6865,6 @@
 </ct:contentTypeSchema>
 </file>
 
-<file path=customXml/item3.xml><?xml version="1.0" encoding="utf-8"?>
-<p:properties xmlns:p="http://schemas.microsoft.com/office/2006/metadata/properties" xmlns:xsi="http://www.w3.org/2001/XMLSchema-instance" xmlns:pc="http://schemas.microsoft.com/office/infopath/2007/PartnerControls">
-  <documentManagement/>
-</p:properties>
-</file>
-
-<file path=customXml/item4.xml><?xml version="1.0" encoding="utf-8"?>
-<?mso-contentType ?>
-<FormTemplates xmlns="http://schemas.microsoft.com/sharepoint/v3/contenttype/forms">
-  <Display>DocumentLibraryForm</Display>
-  <Edit>DocumentLibraryForm</Edit>
-  <New>DocumentLibraryForm</New>
-</FormTemplates>
-</file>
-
-<file path=customXml/item5.xml><?xml version="1.0" encoding="utf-8"?>
-<b:Sources xmlns:b="http://schemas.openxmlformats.org/officeDocument/2006/bibliography" xmlns="http://schemas.openxmlformats.org/officeDocument/2006/bibliography" SelectedStyle="\APA.XSL" StyleName="APA"/>
-</file>
-
 <file path=customXml/itemProps1.xml><?xml version="1.0" encoding="utf-8"?>
 <ds:datastoreItem xmlns:ds="http://schemas.openxmlformats.org/officeDocument/2006/customXml" ds:itemID="{BD7983E9-128A-4574-8F7F-360CE22FC95D}">
   <ds:schemaRefs>
@@ -6793,34 +6874,14 @@
 </file>
 
 <file path=customXml/itemProps2.xml><?xml version="1.0" encoding="utf-8"?>
-<ds:datastoreItem xmlns:ds="http://schemas.openxmlformats.org/officeDocument/2006/customXml" ds:itemID="{E70E6368-7A50-4BC0-818F-4C6F7767774A}">
+<ds:datastoreItem xmlns:ds="http://schemas.openxmlformats.org/officeDocument/2006/customXml" ds:itemID="{B2829109-C8BE-4DF7-A0DB-43F4281593B2}">
   <ds:schemaRefs>
-    <ds:schemaRef ds:uri="http://schemas.microsoft.com/office/2006/metadata/contentType"/>
-    <ds:schemaRef ds:uri="http://schemas.microsoft.com/office/2006/metadata/properties/metaAttributes"/>
-    <ds:schemaRef ds:uri="http://www.w3.org/2001/XMLSchema"/>
-    <ds:schemaRef ds:uri="http://schemas.microsoft.com/office/2006/metadata/properties"/>
-    <ds:schemaRef ds:uri="72e3a154-4955-46c3-9573-e9dec3e1f195"/>
-    <ds:schemaRef ds:uri="ec500478-62e0-46fc-87f1-cfa988e486b4"/>
-    <ds:schemaRef ds:uri="http://schemas.microsoft.com/office/2006/documentManagement/types"/>
-    <ds:schemaRef ds:uri="http://schemas.microsoft.com/office/infopath/2007/PartnerControls"/>
-    <ds:schemaRef ds:uri="http://schemas.openxmlformats.org/package/2006/metadata/core-properties"/>
-    <ds:schemaRef ds:uri="http://purl.org/dc/elements/1.1/"/>
-    <ds:schemaRef ds:uri="http://purl.org/dc/terms/"/>
-    <ds:schemaRef ds:uri="http://schemas.microsoft.com/internal/obd"/>
+    <ds:schemaRef ds:uri="http://schemas.openxmlformats.org/officeDocument/2006/bibliography"/>
   </ds:schemaRefs>
 </ds:datastoreItem>
 </file>
 
 <file path=customXml/itemProps3.xml><?xml version="1.0" encoding="utf-8"?>
-<ds:datastoreItem xmlns:ds="http://schemas.openxmlformats.org/officeDocument/2006/customXml" ds:itemID="{84D81452-B48C-4C21-A0E3-8C8BE66C58A4}">
-  <ds:schemaRefs>
-    <ds:schemaRef ds:uri="http://schemas.microsoft.com/office/2006/metadata/properties"/>
-    <ds:schemaRef ds:uri="http://schemas.microsoft.com/office/infopath/2007/PartnerControls"/>
-  </ds:schemaRefs>
-</ds:datastoreItem>
-</file>
-
-<file path=customXml/itemProps4.xml><?xml version="1.0" encoding="utf-8"?>
 <ds:datastoreItem xmlns:ds="http://schemas.openxmlformats.org/officeDocument/2006/customXml" ds:itemID="{CB339077-4B69-4D62-84AA-CC781E40CCC1}">
   <ds:schemaRefs>
     <ds:schemaRef ds:uri="http://schemas.microsoft.com/sharepoint/v3/contenttype/forms"/>
@@ -6828,10 +6889,17 @@
 </ds:datastoreItem>
 </file>
 
-<file path=customXml/itemProps5.xml><?xml version="1.0" encoding="utf-8"?>
-<ds:datastoreItem xmlns:ds="http://schemas.openxmlformats.org/officeDocument/2006/customXml" ds:itemID="{B2829109-C8BE-4DF7-A0DB-43F4281593B2}">
+<file path=customXml/itemProps4.xml><?xml version="1.0" encoding="utf-8"?>
+<ds:datastoreItem xmlns:ds="http://schemas.openxmlformats.org/officeDocument/2006/customXml" ds:itemID="{84D81452-B48C-4C21-A0E3-8C8BE66C58A4}">
   <ds:schemaRefs>
-    <ds:schemaRef ds:uri="http://schemas.openxmlformats.org/officeDocument/2006/bibliography"/>
+    <ds:schemaRef ds:uri="http://schemas.microsoft.com/office/2006/metadata/properties"/>
+    <ds:schemaRef ds:uri="http://schemas.microsoft.com/office/infopath/2007/PartnerControls"/>
+    <ds:schemaRef ds:uri="ec500478-62e0-46fc-87f1-cfa988e486b4"/>
+    <ds:schemaRef ds:uri="25bcabcf-d275-4206-9fb1-2f2d419cd22b"/>
   </ds:schemaRefs>
 </ds:datastoreItem>
+</file>
+
+<file path=customXml/itemProps5.xml><?xml version="1.0" encoding="utf-8"?>
+<ds:datastoreItem xmlns:ds="http://schemas.openxmlformats.org/officeDocument/2006/customXml" ds:itemID="{8CF6351A-4803-4FE7-852B-55703D127F70}"/>
 </file>
</xml_diff>